<commit_message>
Knowledge - 4/16/2026 - Part 2
</commit_message>
<xml_diff>
--- a/Knowledge/2-Science/4-Applied science/1-Computing/0-Intro to Computing/5-My Source/Computing.docx
+++ b/Knowledge/2-Science/4-Applied science/1-Computing/0-Intro to Computing/5-My Source/Computing.docx
@@ -608,7 +608,27 @@
           <w:szCs w:val="18"/>
           <w:highlight w:val="lightGray"/>
         </w:rPr>
-        <w:t xml:space="preserve"> [Chatgpt (GPT-4-turbo)] </w:t>
+        <w:t xml:space="preserve"> [</w:t>
+      </w:r>
+      <w:r>
+        <w:rPr>
+          <w:rFonts w:ascii="Arial" w:eastAsia="Arial" w:hAnsi="Arial"/>
+          <w:color w:val="000000"/>
+          <w:sz w:val="18"/>
+          <w:szCs w:val="18"/>
+          <w:highlight w:val="lightGray"/>
+        </w:rPr>
+        <w:t>ChatGPT</w:t>
+      </w:r>
+      <w:r>
+        <w:rPr>
+          <w:rFonts w:ascii="Arial" w:eastAsia="Arial" w:hAnsi="Arial"/>
+          <w:color w:val="000000"/>
+          <w:sz w:val="18"/>
+          <w:szCs w:val="18"/>
+          <w:highlight w:val="lightGray"/>
+        </w:rPr>
+        <w:t xml:space="preserve">] </w:t>
       </w:r>
       <w:r>
         <w:rPr>
@@ -872,6 +892,7 @@
         <w:rPr>
           <w:rFonts w:ascii="Roboto Mono" w:eastAsia="Roboto Mono" w:hAnsi="Roboto Mono" w:cs="Roboto Mono"/>
         </w:rPr>
+        <w:lastRenderedPageBreak/>
         <w:t xml:space="preserve">   - Input/Output Devices – keyboards, screens, printers, etc.</w:t>
       </w:r>
     </w:p>
@@ -2246,7 +2267,15 @@
           <w:rFonts w:ascii="Roboto Mono" w:eastAsia="Roboto Mono" w:hAnsi="Roboto Mono" w:cs="Roboto Mono"/>
           <w:color w:val="202122"/>
         </w:rPr>
-        <w:t xml:space="preserve"> It is the act of using insights to conceive, model and scale a solution to a problem. The first reference to the term is the 1968 </w:t>
+        <w:t xml:space="preserve"> It is the act of using insights to conceive, model and scale a solution to a problem. </w:t>
+      </w:r>
+      <w:r>
+        <w:rPr>
+          <w:rFonts w:ascii="Roboto Mono" w:eastAsia="Roboto Mono" w:hAnsi="Roboto Mono" w:cs="Roboto Mono"/>
+          <w:color w:val="202122"/>
+        </w:rPr>
+        <w:lastRenderedPageBreak/>
+        <w:t xml:space="preserve">The first reference to the term is the 1968 </w:t>
       </w:r>
       <w:hyperlink r:id="rId36">
         <w:r>
@@ -2828,7 +2857,15 @@
             <w:rFonts w:ascii="Roboto Mono" w:eastAsia="Roboto Mono" w:hAnsi="Roboto Mono" w:cs="Roboto Mono"/>
             <w:color w:val="3366CC"/>
           </w:rPr>
-          <w:t>computational complexity theory</w:t>
+          <w:t xml:space="preserve">computational complexity </w:t>
+        </w:r>
+        <w:r>
+          <w:rPr>
+            <w:rFonts w:ascii="Roboto Mono" w:eastAsia="Roboto Mono" w:hAnsi="Roboto Mono" w:cs="Roboto Mono"/>
+            <w:color w:val="3366CC"/>
+          </w:rPr>
+          <w:lastRenderedPageBreak/>
+          <w:t>theory</w:t>
         </w:r>
       </w:hyperlink>
       <w:r>
@@ -3548,7 +3585,18 @@
           <w:szCs w:val="18"/>
           <w:highlight w:val="lightGray"/>
         </w:rPr>
-        <w:t>: [</w:t>
+        <w:t xml:space="preserve">: </w:t>
+      </w:r>
+      <w:r>
+        <w:rPr>
+          <w:rFonts w:ascii="Arial" w:eastAsia="Arial" w:hAnsi="Arial"/>
+          <w:color w:val="000000" w:themeColor="text1"/>
+          <w:sz w:val="18"/>
+          <w:szCs w:val="18"/>
+          <w:highlight w:val="lightGray"/>
+        </w:rPr>
+        <w:lastRenderedPageBreak/>
+        <w:t>[</w:t>
       </w:r>
       <w:r>
         <w:rPr>
@@ -4230,6 +4278,7 @@
         <w:rPr>
           <w:rFonts w:ascii="Roboto Mono" w:eastAsia="Roboto Mono" w:hAnsi="Roboto Mono" w:cs="Roboto Mono"/>
         </w:rPr>
+        <w:lastRenderedPageBreak/>
         <w:t xml:space="preserve">The study of IS bridges business and </w:t>
       </w:r>
       <w:hyperlink r:id="rId77">

</xml_diff>